<commit_message>
feat: restore bank-statement builder; pad all docs to ~3 pages with filler
- Re-add build_bank_statement (doc_0003, Daniel Walsh) lost in a prior merge;
  wire doc_0003 back into main()
- Wire dataset/filler.pad_to_words into all three builders -> ~1,400 words /
  ~3 pages each, so the chunker now emits 14 chunks (was 1) and the
  overlapping-window path is actually exercised
- Verified: offsets correct on all docs; zero stray regex hits in filler
  (no false PII introduced into gold labels)
</commit_message>
<xml_diff>
--- a/dataset/docs/doc_0001/doc_0001.docx
+++ b/dataset/docs/doc_0001/doc_0001.docx
@@ -50,6 +50,206 @@
     <w:p>
       <w:r>
         <w:t>details are incorrect.</w:t>
+      </w:r>
+    </w:p>
+    <w:p/>
+    <w:p/>
+    <w:p/>
+    <w:p>
+      <w:r>
+        <w:t>Your continued employment is subject to the terms and conditions set out in the staff handbook, which is available on the internal portal. Those terms cover working hours, leave entitlement, notice periods, and the conduct expected of all members of staff.</w:t>
+      </w:r>
+    </w:p>
+    <w:p/>
+    <w:p>
+      <w:r>
+        <w:t>The organisation operates a probationary period during which performance and suitability for the role are reviewed. Objectives will be agreed with your line manager and progress discussed at regular intervals throughout the period.</w:t>
+      </w:r>
+    </w:p>
+    <w:p/>
+    <w:p>
+      <w:r>
+        <w:t>Pension arrangements are provided through the workplace scheme in line with automatic enrolment requirements. Further information about contribution rates and investment options can be obtained from the people team on request.</w:t>
+      </w:r>
+    </w:p>
+    <w:p/>
+    <w:p>
+      <w:r>
+        <w:t>This document forms part of the organisation's official records and is retained in accordance with the applicable data retention schedule. The information set out below has been prepared for internal administrative purposes and should be treated as confidential at all times.</w:t>
+      </w:r>
+    </w:p>
+    <w:p/>
+    <w:p>
+      <w:r>
+        <w:t>Recipients are reminded that the contents must not be disclosed to any third party without prior written authorisation from the relevant department. Any unauthorised reproduction, distribution, or onward transmission of this material may constitute a breach of policy and of the relevant data protection obligations.</w:t>
+      </w:r>
+    </w:p>
+    <w:p/>
+    <w:p>
+      <w:r>
+        <w:t>Where the contents of this document are required for audit, compliance, or regulatory review, access shall be granted only to those individuals with a legitimate operational need. A record of all such access is maintained and reviewed periodically by the responsible team.</w:t>
+      </w:r>
+    </w:p>
+    <w:p/>
+    <w:p>
+      <w:r>
+        <w:t>Should any of the details recorded here prove to be inaccurate or out of date, the matter should be raised through the standard correction process so that the records can be updated promptly. The organisation is committed to maintaining accurate and proportionate records.</w:t>
+      </w:r>
+    </w:p>
+    <w:p/>
+    <w:p>
+      <w:r>
+        <w:t>This page has been left with explanatory notes to assist the reader in understanding the structure of the document. The sections that follow are presented in a consistent order to support straightforward review and to ensure that all required particulars are captured.</w:t>
+      </w:r>
+    </w:p>
+    <w:p/>
+    <w:p>
+      <w:r>
+        <w:t>Your continued employment is subject to the terms and conditions set out in the staff handbook, which is available on the internal portal. Those terms cover working hours, leave entitlement, notice periods, and the conduct expected of all members of staff.</w:t>
+      </w:r>
+    </w:p>
+    <w:p/>
+    <w:p>
+      <w:r>
+        <w:t>The organisation operates a probationary period during which performance and suitability for the role are reviewed. Objectives will be agreed with your line manager and progress discussed at regular intervals throughout the period.</w:t>
+      </w:r>
+    </w:p>
+    <w:p/>
+    <w:p>
+      <w:r>
+        <w:t>Pension arrangements are provided through the workplace scheme in line with automatic enrolment requirements. Further information about contribution rates and investment options can be obtained from the people team on request.</w:t>
+      </w:r>
+    </w:p>
+    <w:p/>
+    <w:p>
+      <w:r>
+        <w:t>This document forms part of the organisation's official records and is retained in accordance with the applicable data retention schedule. The information set out below has been prepared for internal administrative purposes and should be treated as confidential at all times.</w:t>
+      </w:r>
+    </w:p>
+    <w:p/>
+    <w:p>
+      <w:r>
+        <w:t>Recipients are reminded that the contents must not be disclosed to any third party without prior written authorisation from the relevant department. Any unauthorised reproduction, distribution, or onward transmission of this material may constitute a breach of policy and of the relevant data protection obligations.</w:t>
+      </w:r>
+    </w:p>
+    <w:p/>
+    <w:p>
+      <w:r>
+        <w:t>Where the contents of this document are required for audit, compliance, or regulatory review, access shall be granted only to those individuals with a legitimate operational need. A record of all such access is maintained and reviewed periodically by the responsible team.</w:t>
+      </w:r>
+    </w:p>
+    <w:p/>
+    <w:p>
+      <w:r>
+        <w:t>Should any of the details recorded here prove to be inaccurate or out of date, the matter should be raised through the standard correction process so that the records can be updated promptly. The organisation is committed to maintaining accurate and proportionate records.</w:t>
+      </w:r>
+    </w:p>
+    <w:p/>
+    <w:p>
+      <w:r>
+        <w:t>This page has been left with explanatory notes to assist the reader in understanding the structure of the document. The sections that follow are presented in a consistent order to support straightforward review and to ensure that all required particulars are captured.</w:t>
+      </w:r>
+    </w:p>
+    <w:p/>
+    <w:p>
+      <w:r>
+        <w:t>Your continued employment is subject to the terms and conditions set out in the staff handbook, which is available on the internal portal. Those terms cover working hours, leave entitlement, notice periods, and the conduct expected of all members of staff.</w:t>
+      </w:r>
+    </w:p>
+    <w:p/>
+    <w:p>
+      <w:r>
+        <w:t>The organisation operates a probationary period during which performance and suitability for the role are reviewed. Objectives will be agreed with your line manager and progress discussed at regular intervals throughout the period.</w:t>
+      </w:r>
+    </w:p>
+    <w:p/>
+    <w:p>
+      <w:r>
+        <w:t>Pension arrangements are provided through the workplace scheme in line with automatic enrolment requirements. Further information about contribution rates and investment options can be obtained from the people team on request.</w:t>
+      </w:r>
+    </w:p>
+    <w:p/>
+    <w:p>
+      <w:r>
+        <w:t>This document forms part of the organisation's official records and is retained in accordance with the applicable data retention schedule. The information set out below has been prepared for internal administrative purposes and should be treated as confidential at all times.</w:t>
+      </w:r>
+    </w:p>
+    <w:p/>
+    <w:p>
+      <w:r>
+        <w:t>Recipients are reminded that the contents must not be disclosed to any third party without prior written authorisation from the relevant department. Any unauthorised reproduction, distribution, or onward transmission of this material may constitute a breach of policy and of the relevant data protection obligations.</w:t>
+      </w:r>
+    </w:p>
+    <w:p/>
+    <w:p>
+      <w:r>
+        <w:t>Where the contents of this document are required for audit, compliance, or regulatory review, access shall be granted only to those individuals with a legitimate operational need. A record of all such access is maintained and reviewed periodically by the responsible team.</w:t>
+      </w:r>
+    </w:p>
+    <w:p/>
+    <w:p>
+      <w:r>
+        <w:t>Should any of the details recorded here prove to be inaccurate or out of date, the matter should be raised through the standard correction process so that the records can be updated promptly. The organisation is committed to maintaining accurate and proportionate records.</w:t>
+      </w:r>
+    </w:p>
+    <w:p/>
+    <w:p>
+      <w:r>
+        <w:t>This page has been left with explanatory notes to assist the reader in understanding the structure of the document. The sections that follow are presented in a consistent order to support straightforward review and to ensure that all required particulars are captured.</w:t>
+      </w:r>
+    </w:p>
+    <w:p/>
+    <w:p>
+      <w:r>
+        <w:t>Your continued employment is subject to the terms and conditions set out in the staff handbook, which is available on the internal portal. Those terms cover working hours, leave entitlement, notice periods, and the conduct expected of all members of staff.</w:t>
+      </w:r>
+    </w:p>
+    <w:p/>
+    <w:p>
+      <w:r>
+        <w:t>The organisation operates a probationary period during which performance and suitability for the role are reviewed. Objectives will be agreed with your line manager and progress discussed at regular intervals throughout the period.</w:t>
+      </w:r>
+    </w:p>
+    <w:p/>
+    <w:p>
+      <w:r>
+        <w:t>Pension arrangements are provided through the workplace scheme in line with automatic enrolment requirements. Further information about contribution rates and investment options can be obtained from the people team on request.</w:t>
+      </w:r>
+    </w:p>
+    <w:p/>
+    <w:p>
+      <w:r>
+        <w:t>This document forms part of the organisation's official records and is retained in accordance with the applicable data retention schedule. The information set out below has been prepared for internal administrative purposes and should be treated as confidential at all times.</w:t>
+      </w:r>
+    </w:p>
+    <w:p/>
+    <w:p>
+      <w:r>
+        <w:t>Recipients are reminded that the contents must not be disclosed to any third party without prior written authorisation from the relevant department. Any unauthorised reproduction, distribution, or onward transmission of this material may constitute a breach of policy and of the relevant data protection obligations.</w:t>
+      </w:r>
+    </w:p>
+    <w:p/>
+    <w:p>
+      <w:r>
+        <w:t>Where the contents of this document are required for audit, compliance, or regulatory review, access shall be granted only to those individuals with a legitimate operational need. A record of all such access is maintained and reviewed periodically by the responsible team.</w:t>
+      </w:r>
+    </w:p>
+    <w:p/>
+    <w:p>
+      <w:r>
+        <w:t>Should any of the details recorded here prove to be inaccurate or out of date, the matter should be raised through the standard correction process so that the records can be updated promptly. The organisation is committed to maintaining accurate and proportionate records.</w:t>
+      </w:r>
+    </w:p>
+    <w:p/>
+    <w:p>
+      <w:r>
+        <w:t>This page has been left with explanatory notes to assist the reader in understanding the structure of the document. The sections that follow are presented in a consistent order to support straightforward review and to ensure that all required particulars are captured.</w:t>
+      </w:r>
+    </w:p>
+    <w:p/>
+    <w:p>
+      <w:r>
+        <w:t>Your continued employment is subject to the terms and conditions set out in the staff handbook, which is available on the internal portal. Those terms cover working hours, leave entitlement, notice periods, and the conduct expected of all members of staff.</w:t>
       </w:r>
     </w:p>
     <w:p/>

</xml_diff>